<commit_message>
Correct the HIMASKOM profile site year to 2026
It was recorded as 2024 in both the CV and the site data. In the CV the
project list runs newest first, so the entry also moves up into the 2026
group rather than sitting at the bottom.

Co-Authored-By: Claude Opus 5 <noreply@anthropic.com>
Claude-Session: https://claude.ai/code/session_01TZmhjMntN4hDREhoG8ywEQ
</commit_message>
<xml_diff>
--- a/cv/Syafik_Barda_CV.docx
+++ b/cv/Syafik_Barda_CV.docx
@@ -1027,6 +1027,93 @@
           <w:smallCaps w:val="0"/>
           <w:sz w:val="20"/>
         </w:rPr>
+        <w:t>HIMASKOM Company Profile Website</w:t>
+      </w:r>
+      <w:r>
+        <w:rPr>
+          <w:b w:val="0"/>
+          <w:i w:val="0"/>
+          <w:smallCaps w:val="0"/>
+          <w:sz w:val="20"/>
+        </w:rPr>
+        <w:tab/>
+        <w:t>2026</w:t>
+      </w:r>
+    </w:p>
+    <w:p>
+      <w:pPr>
+        <w:pStyle w:val="ListBullet"/>
+        <w:spacing w:after="20" w:line="252" w:lineRule="auto"/>
+        <w:ind w:left="283" w:hanging="170"/>
+      </w:pPr>
+      <w:r>
+        <w:rPr>
+          <w:b w:val="0"/>
+          <w:i w:val="0"/>
+          <w:smallCaps w:val="0"/>
+          <w:sz w:val="20"/>
+        </w:rPr>
+        <w:t>Designed and developed the official website for HIMASKOM UNDIP, presenting the association vision, work programs, division structure, and activities to prospective and current members.</w:t>
+      </w:r>
+    </w:p>
+    <w:p>
+      <w:pPr>
+        <w:pStyle w:val="ListBullet"/>
+        <w:spacing w:after="20" w:line="252" w:lineRule="auto"/>
+        <w:ind w:left="283" w:hanging="170"/>
+      </w:pPr>
+      <w:r>
+        <w:rPr>
+          <w:b w:val="0"/>
+          <w:i w:val="0"/>
+          <w:smallCaps w:val="0"/>
+          <w:sz w:val="20"/>
+        </w:rPr>
+        <w:t>Modelled the organizational hierarchy, article index, and merchandise store as one typed data module so internal staff can keep the site current with minimal technical effort.</w:t>
+      </w:r>
+    </w:p>
+    <w:p>
+      <w:pPr>
+        <w:spacing w:after="0" w:before="0"/>
+      </w:pPr>
+      <w:r>
+        <w:rPr>
+          <w:b/>
+          <w:i w:val="0"/>
+          <w:smallCaps w:val="0"/>
+          <w:sz w:val="19"/>
+        </w:rPr>
+        <w:t xml:space="preserve">Tech: </w:t>
+      </w:r>
+      <w:r>
+        <w:rPr>
+          <w:b w:val="0"/>
+          <w:i w:val="0"/>
+          <w:smallCaps w:val="0"/>
+          <w:sz w:val="19"/>
+        </w:rPr>
+        <w:t>Next.js, React, TypeScript, CSS Modules, GSAP, Lenis</w:t>
+      </w:r>
+    </w:p>
+    <w:p>
+      <w:pPr>
+        <w:spacing w:after="100" w:before="0"/>
+      </w:pPr>
+    </w:p>
+    <w:p>
+      <w:pPr>
+        <w:tabs>
+          <w:tab w:pos="10540" w:val="right"/>
+        </w:tabs>
+        <w:spacing w:after="0" w:before="0"/>
+      </w:pPr>
+      <w:r>
+        <w:rPr>
+          <w:b/>
+          <w:i w:val="0"/>
+          <w:smallCaps w:val="0"/>
+          <w:sz w:val="20"/>
+        </w:rPr>
         <w:t>Swadaya Panen – IoT-Based Rice Field Monitoring System</w:t>
       </w:r>
       <w:r>
@@ -1267,93 +1354,6 @@
           <w:sz w:val="19"/>
         </w:rPr>
         <w:t>React Native, Expo, TypeScript, Supabase, Express.js, Chart Kit</w:t>
-      </w:r>
-    </w:p>
-    <w:p>
-      <w:pPr>
-        <w:spacing w:after="100" w:before="0"/>
-      </w:pPr>
-    </w:p>
-    <w:p>
-      <w:pPr>
-        <w:tabs>
-          <w:tab w:pos="10540" w:val="right"/>
-        </w:tabs>
-        <w:spacing w:after="0" w:before="0"/>
-      </w:pPr>
-      <w:r>
-        <w:rPr>
-          <w:b/>
-          <w:i w:val="0"/>
-          <w:smallCaps w:val="0"/>
-          <w:sz w:val="20"/>
-        </w:rPr>
-        <w:t>HIMASKOM Company Profile Website</w:t>
-      </w:r>
-      <w:r>
-        <w:rPr>
-          <w:b w:val="0"/>
-          <w:i w:val="0"/>
-          <w:smallCaps w:val="0"/>
-          <w:sz w:val="20"/>
-        </w:rPr>
-        <w:tab/>
-        <w:t>2024</w:t>
-      </w:r>
-    </w:p>
-    <w:p>
-      <w:pPr>
-        <w:pStyle w:val="ListBullet"/>
-        <w:spacing w:after="20" w:line="252" w:lineRule="auto"/>
-        <w:ind w:left="283" w:hanging="170"/>
-      </w:pPr>
-      <w:r>
-        <w:rPr>
-          <w:b w:val="0"/>
-          <w:i w:val="0"/>
-          <w:smallCaps w:val="0"/>
-          <w:sz w:val="20"/>
-        </w:rPr>
-        <w:t>Designed and developed the official website for HIMASKOM UNDIP, presenting the association vision, work programs, division structure, and activities to prospective and current members.</w:t>
-      </w:r>
-    </w:p>
-    <w:p>
-      <w:pPr>
-        <w:pStyle w:val="ListBullet"/>
-        <w:spacing w:after="20" w:line="252" w:lineRule="auto"/>
-        <w:ind w:left="283" w:hanging="170"/>
-      </w:pPr>
-      <w:r>
-        <w:rPr>
-          <w:b w:val="0"/>
-          <w:i w:val="0"/>
-          <w:smallCaps w:val="0"/>
-          <w:sz w:val="20"/>
-        </w:rPr>
-        <w:t>Modelled the organizational hierarchy, article index, and merchandise store as one typed data module so internal staff can keep the site current with minimal technical effort.</w:t>
-      </w:r>
-    </w:p>
-    <w:p>
-      <w:pPr>
-        <w:spacing w:after="0" w:before="0"/>
-      </w:pPr>
-      <w:r>
-        <w:rPr>
-          <w:b/>
-          <w:i w:val="0"/>
-          <w:smallCaps w:val="0"/>
-          <w:sz w:val="19"/>
-        </w:rPr>
-        <w:t xml:space="preserve">Tech: </w:t>
-      </w:r>
-      <w:r>
-        <w:rPr>
-          <w:b w:val="0"/>
-          <w:i w:val="0"/>
-          <w:smallCaps w:val="0"/>
-          <w:sz w:val="19"/>
-        </w:rPr>
-        <w:t>Next.js, React, TypeScript, CSS Modules, GSAP, Lenis</w:t>
       </w:r>
     </w:p>
     <w:p>

</xml_diff>

<commit_message>
Add LinkedIn contact, correct WHS internship dates, add a frontend CV
</commit_message>
<xml_diff>
--- a/cv/Syafik_Barda_CV.docx
+++ b/cv/Syafik_Barda_CV.docx
@@ -52,6 +52,17 @@
         <w:spacing w:after="20" w:before="0"/>
         <w:jc w:val="center"/>
       </w:pPr>
+      <w:hyperlink r:id="rId9">
+        <w:r>
+          <w:rPr>
+            <w:b w:val="0"/>
+            <w:i w:val="0"/>
+            <w:smallCaps w:val="0"/>
+            <w:sz w:val="19"/>
+          </w:rPr>
+          <w:t>github.com/syafikbarda60</w:t>
+        </w:r>
+      </w:hyperlink>
       <w:r>
         <w:rPr>
           <w:b w:val="0"/>
@@ -59,11 +70,43 @@
           <w:smallCaps w:val="0"/>
           <w:sz w:val="19"/>
         </w:rPr>
-        <w:t>github.com/syafikbarda60  ·  portofolio-web-five-hazel.vercel.app</w:t>
+        <w:t xml:space="preserve">  ·  </w:t>
       </w:r>
+      <w:hyperlink r:id="rId10">
+        <w:r>
+          <w:rPr>
+            <w:b w:val="0"/>
+            <w:i w:val="0"/>
+            <w:smallCaps w:val="0"/>
+            <w:sz w:val="19"/>
+          </w:rPr>
+          <w:t>linkedin.com/in/syafik-barda-7077573ab</w:t>
+        </w:r>
+      </w:hyperlink>
+      <w:r>
+        <w:rPr>
+          <w:b w:val="0"/>
+          <w:i w:val="0"/>
+          <w:smallCaps w:val="0"/>
+          <w:sz w:val="19"/>
+        </w:rPr>
+        <w:t xml:space="preserve">  ·  </w:t>
+      </w:r>
+      <w:hyperlink r:id="rId11">
+        <w:r>
+          <w:rPr>
+            <w:b w:val="0"/>
+            <w:i w:val="0"/>
+            <w:smallCaps w:val="0"/>
+            <w:sz w:val="19"/>
+          </w:rPr>
+          <w:t>portofolio-web-five-hazel.vercel.app</w:t>
+        </w:r>
+      </w:hyperlink>
     </w:p>
     <w:p>
       <w:pPr>
+        <w:keepNext/>
         <w:spacing w:after="60" w:before="180"/>
         <w:pBdr>
           <w:bottom w:val="single" w:sz="8" w:space="1" w:color="1A1A1A"/>
@@ -95,6 +138,7 @@
     </w:p>
     <w:p>
       <w:pPr>
+        <w:keepNext/>
         <w:spacing w:after="60" w:before="180"/>
         <w:pBdr>
           <w:bottom w:val="single" w:sz="8" w:space="1" w:color="1A1A1A"/>
@@ -112,8 +156,9 @@
     </w:p>
     <w:p>
       <w:pPr>
+        <w:keepNext/>
         <w:tabs>
-          <w:tab w:pos="10540" w:val="right"/>
+          <w:tab w:pos="10206" w:val="right"/>
         </w:tabs>
         <w:spacing w:after="0" w:before="0"/>
       </w:pPr>
@@ -139,8 +184,9 @@
     </w:p>
     <w:p>
       <w:pPr>
+        <w:keepNext/>
         <w:tabs>
-          <w:tab w:pos="10540" w:val="right"/>
+          <w:tab w:pos="10206" w:val="right"/>
         </w:tabs>
         <w:spacing w:after="0" w:before="0"/>
       </w:pPr>
@@ -151,7 +197,7 @@
           <w:smallCaps w:val="0"/>
           <w:sz w:val="20"/>
         </w:rPr>
-        <w:t>Website Developer</w:t>
+        <w:t>Web Developer Intern</w:t>
       </w:r>
       <w:r>
         <w:rPr>
@@ -161,12 +207,13 @@
           <w:sz w:val="20"/>
         </w:rPr>
         <w:tab/>
-        <w:t>Jun 2025 – Aug 2025</w:t>
+        <w:t>Jun 2025 – Jul 2025</w:t>
       </w:r>
     </w:p>
     <w:p>
       <w:pPr>
         <w:pStyle w:val="ListBullet"/>
+        <w:keepNext/>
         <w:spacing w:after="20" w:line="252" w:lineRule="auto"/>
         <w:ind w:left="283" w:hanging="170"/>
       </w:pPr>
@@ -183,6 +230,7 @@
     <w:p>
       <w:pPr>
         <w:pStyle w:val="ListBullet"/>
+        <w:keepNext/>
         <w:spacing w:after="20" w:line="252" w:lineRule="auto"/>
         <w:ind w:left="283" w:hanging="170"/>
       </w:pPr>
@@ -199,6 +247,7 @@
     <w:p>
       <w:pPr>
         <w:pStyle w:val="ListBullet"/>
+        <w:keepNext/>
         <w:spacing w:after="20" w:line="252" w:lineRule="auto"/>
         <w:ind w:left="283" w:hanging="170"/>
       </w:pPr>
@@ -214,6 +263,7 @@
     </w:p>
     <w:p>
       <w:pPr>
+        <w:keepNext/>
         <w:spacing w:after="0" w:before="0"/>
       </w:pPr>
       <w:r>
@@ -242,8 +292,9 @@
     </w:p>
     <w:p>
       <w:pPr>
+        <w:keepNext/>
         <w:tabs>
-          <w:tab w:pos="10540" w:val="right"/>
+          <w:tab w:pos="10206" w:val="right"/>
         </w:tabs>
         <w:spacing w:after="0" w:before="0"/>
       </w:pPr>
@@ -269,8 +320,9 @@
     </w:p>
     <w:p>
       <w:pPr>
+        <w:keepNext/>
         <w:tabs>
-          <w:tab w:pos="10540" w:val="right"/>
+          <w:tab w:pos="10206" w:val="right"/>
         </w:tabs>
         <w:spacing w:after="0" w:before="0"/>
       </w:pPr>
@@ -297,6 +349,7 @@
     <w:p>
       <w:pPr>
         <w:pStyle w:val="ListBullet"/>
+        <w:keepNext/>
         <w:spacing w:after="20" w:line="252" w:lineRule="auto"/>
         <w:ind w:left="283" w:hanging="170"/>
       </w:pPr>
@@ -313,6 +366,7 @@
     <w:p>
       <w:pPr>
         <w:pStyle w:val="ListBullet"/>
+        <w:keepNext/>
         <w:spacing w:after="20" w:line="252" w:lineRule="auto"/>
         <w:ind w:left="283" w:hanging="170"/>
       </w:pPr>
@@ -329,6 +383,7 @@
     <w:p>
       <w:pPr>
         <w:pStyle w:val="ListBullet"/>
+        <w:keepNext/>
         <w:spacing w:after="20" w:line="252" w:lineRule="auto"/>
         <w:ind w:left="283" w:hanging="170"/>
       </w:pPr>
@@ -349,6 +404,7 @@
     </w:p>
     <w:p>
       <w:pPr>
+        <w:keepNext/>
         <w:spacing w:after="60" w:before="180"/>
         <w:pBdr>
           <w:bottom w:val="single" w:sz="8" w:space="1" w:color="1A1A1A"/>
@@ -366,8 +422,9 @@
     </w:p>
     <w:p>
       <w:pPr>
+        <w:keepNext/>
         <w:tabs>
-          <w:tab w:pos="10540" w:val="right"/>
+          <w:tab w:pos="10206" w:val="right"/>
         </w:tabs>
         <w:spacing w:after="0" w:before="0"/>
       </w:pPr>
@@ -393,8 +450,9 @@
     </w:p>
     <w:p>
       <w:pPr>
+        <w:keepNext/>
         <w:tabs>
-          <w:tab w:pos="10540" w:val="right"/>
+          <w:tab w:pos="10206" w:val="right"/>
         </w:tabs>
         <w:spacing w:after="0" w:before="0"/>
       </w:pPr>
@@ -420,8 +478,9 @@
     </w:p>
     <w:p>
       <w:pPr>
+        <w:keepNext/>
         <w:tabs>
-          <w:tab w:pos="10540" w:val="right"/>
+          <w:tab w:pos="10206" w:val="right"/>
         </w:tabs>
         <w:spacing w:after="0" w:before="0"/>
       </w:pPr>
@@ -448,6 +507,7 @@
     <w:p>
       <w:pPr>
         <w:pStyle w:val="ListBullet"/>
+        <w:keepNext/>
         <w:spacing w:after="20" w:line="252" w:lineRule="auto"/>
         <w:ind w:left="283" w:hanging="170"/>
       </w:pPr>
@@ -458,12 +518,13 @@
           <w:smallCaps w:val="0"/>
           <w:sz w:val="20"/>
         </w:rPr>
-        <w:t>Implemented a structural reform by establishing the Monitoring and Upgrading Division to oversee and raise the performance of all HIMASKOM 25 members.</w:t>
+        <w:t>Implemented a structural reform by establishing the Monitoring and Upgrading Division to oversee and raise the performance of all HIMASKOM 120+ members.</w:t>
       </w:r>
     </w:p>
     <w:p>
       <w:pPr>
         <w:pStyle w:val="ListBullet"/>
+        <w:keepNext/>
         <w:spacing w:after="20" w:line="252" w:lineRule="auto"/>
         <w:ind w:left="283" w:hanging="170"/>
       </w:pPr>
@@ -480,6 +541,7 @@
     <w:p>
       <w:pPr>
         <w:pStyle w:val="ListBullet"/>
+        <w:keepNext/>
         <w:spacing w:after="20" w:line="252" w:lineRule="auto"/>
         <w:ind w:left="283" w:hanging="170"/>
       </w:pPr>
@@ -500,8 +562,9 @@
     </w:p>
     <w:p>
       <w:pPr>
+        <w:keepNext/>
         <w:tabs>
-          <w:tab w:pos="10540" w:val="right"/>
+          <w:tab w:pos="10206" w:val="right"/>
         </w:tabs>
         <w:spacing w:after="0" w:before="0"/>
       </w:pPr>
@@ -527,8 +590,9 @@
     </w:p>
     <w:p>
       <w:pPr>
+        <w:keepNext/>
         <w:tabs>
-          <w:tab w:pos="10540" w:val="right"/>
+          <w:tab w:pos="10206" w:val="right"/>
         </w:tabs>
         <w:spacing w:after="0" w:before="0"/>
       </w:pPr>
@@ -555,6 +619,7 @@
     <w:p>
       <w:pPr>
         <w:pStyle w:val="ListBullet"/>
+        <w:keepNext/>
         <w:spacing w:after="20" w:line="252" w:lineRule="auto"/>
         <w:ind w:left="283" w:hanging="170"/>
       </w:pPr>
@@ -575,8 +640,9 @@
     </w:p>
     <w:p>
       <w:pPr>
+        <w:keepNext/>
         <w:tabs>
-          <w:tab w:pos="10540" w:val="right"/>
+          <w:tab w:pos="10206" w:val="right"/>
         </w:tabs>
         <w:spacing w:after="0" w:before="0"/>
       </w:pPr>
@@ -602,8 +668,9 @@
     </w:p>
     <w:p>
       <w:pPr>
+        <w:keepNext/>
         <w:tabs>
-          <w:tab w:pos="10540" w:val="right"/>
+          <w:tab w:pos="10206" w:val="right"/>
         </w:tabs>
         <w:spacing w:after="0" w:before="0"/>
       </w:pPr>
@@ -630,6 +697,7 @@
     <w:p>
       <w:pPr>
         <w:pStyle w:val="ListBullet"/>
+        <w:keepNext/>
         <w:spacing w:after="20" w:line="252" w:lineRule="auto"/>
         <w:ind w:left="283" w:hanging="170"/>
       </w:pPr>
@@ -650,6 +718,7 @@
     </w:p>
     <w:p>
       <w:pPr>
+        <w:keepNext/>
         <w:spacing w:after="60" w:before="180"/>
         <w:pBdr>
           <w:bottom w:val="single" w:sz="8" w:space="1" w:color="1A1A1A"/>
@@ -667,8 +736,9 @@
     </w:p>
     <w:p>
       <w:pPr>
+        <w:keepNext/>
         <w:tabs>
-          <w:tab w:pos="10540" w:val="right"/>
+          <w:tab w:pos="10206" w:val="right"/>
         </w:tabs>
         <w:spacing w:after="0" w:before="0"/>
       </w:pPr>
@@ -695,6 +765,7 @@
     <w:p>
       <w:pPr>
         <w:pStyle w:val="ListBullet"/>
+        <w:keepNext/>
         <w:spacing w:after="20" w:line="252" w:lineRule="auto"/>
         <w:ind w:left="283" w:hanging="170"/>
       </w:pPr>
@@ -711,6 +782,7 @@
     <w:p>
       <w:pPr>
         <w:pStyle w:val="ListBullet"/>
+        <w:keepNext/>
         <w:spacing w:after="20" w:line="252" w:lineRule="auto"/>
         <w:ind w:left="283" w:hanging="170"/>
       </w:pPr>
@@ -726,6 +798,7 @@
     </w:p>
     <w:p>
       <w:pPr>
+        <w:keepNext/>
         <w:spacing w:after="0" w:before="0"/>
       </w:pPr>
       <w:r>
@@ -754,8 +827,9 @@
     </w:p>
     <w:p>
       <w:pPr>
+        <w:keepNext/>
         <w:tabs>
-          <w:tab w:pos="10540" w:val="right"/>
+          <w:tab w:pos="10206" w:val="right"/>
         </w:tabs>
         <w:spacing w:after="0" w:before="0"/>
       </w:pPr>
@@ -782,6 +856,7 @@
     <w:p>
       <w:pPr>
         <w:pStyle w:val="ListBullet"/>
+        <w:keepNext/>
         <w:spacing w:after="20" w:line="252" w:lineRule="auto"/>
         <w:ind w:left="283" w:hanging="170"/>
       </w:pPr>
@@ -798,6 +873,7 @@
     <w:p>
       <w:pPr>
         <w:pStyle w:val="ListBullet"/>
+        <w:keepNext/>
         <w:spacing w:after="20" w:line="252" w:lineRule="auto"/>
         <w:ind w:left="283" w:hanging="170"/>
       </w:pPr>
@@ -813,6 +889,7 @@
     </w:p>
     <w:p>
       <w:pPr>
+        <w:keepNext/>
         <w:spacing w:after="0" w:before="0"/>
       </w:pPr>
       <w:r>
@@ -841,8 +918,9 @@
     </w:p>
     <w:p>
       <w:pPr>
+        <w:keepNext/>
         <w:tabs>
-          <w:tab w:pos="10540" w:val="right"/>
+          <w:tab w:pos="10206" w:val="right"/>
         </w:tabs>
         <w:spacing w:after="0" w:before="0"/>
       </w:pPr>
@@ -869,6 +947,7 @@
     <w:p>
       <w:pPr>
         <w:pStyle w:val="ListBullet"/>
+        <w:keepNext/>
         <w:spacing w:after="20" w:line="252" w:lineRule="auto"/>
         <w:ind w:left="283" w:hanging="170"/>
       </w:pPr>
@@ -885,6 +964,7 @@
     <w:p>
       <w:pPr>
         <w:pStyle w:val="ListBullet"/>
+        <w:keepNext/>
         <w:spacing w:after="20" w:line="252" w:lineRule="auto"/>
         <w:ind w:left="283" w:hanging="170"/>
       </w:pPr>
@@ -900,6 +980,7 @@
     </w:p>
     <w:p>
       <w:pPr>
+        <w:keepNext/>
         <w:spacing w:after="0" w:before="0"/>
       </w:pPr>
       <w:r>
@@ -928,8 +1009,9 @@
     </w:p>
     <w:p>
       <w:pPr>
+        <w:keepNext/>
         <w:tabs>
-          <w:tab w:pos="10540" w:val="right"/>
+          <w:tab w:pos="10206" w:val="right"/>
         </w:tabs>
         <w:spacing w:after="0" w:before="0"/>
       </w:pPr>
@@ -956,6 +1038,7 @@
     <w:p>
       <w:pPr>
         <w:pStyle w:val="ListBullet"/>
+        <w:keepNext/>
         <w:spacing w:after="20" w:line="252" w:lineRule="auto"/>
         <w:ind w:left="283" w:hanging="170"/>
       </w:pPr>
@@ -972,6 +1055,7 @@
     <w:p>
       <w:pPr>
         <w:pStyle w:val="ListBullet"/>
+        <w:keepNext/>
         <w:spacing w:after="20" w:line="252" w:lineRule="auto"/>
         <w:ind w:left="283" w:hanging="170"/>
       </w:pPr>
@@ -987,6 +1071,7 @@
     </w:p>
     <w:p>
       <w:pPr>
+        <w:keepNext/>
         <w:spacing w:after="0" w:before="0"/>
       </w:pPr>
       <w:r>
@@ -1015,8 +1100,9 @@
     </w:p>
     <w:p>
       <w:pPr>
+        <w:keepNext/>
         <w:tabs>
-          <w:tab w:pos="10540" w:val="right"/>
+          <w:tab w:pos="10206" w:val="right"/>
         </w:tabs>
         <w:spacing w:after="0" w:before="0"/>
       </w:pPr>
@@ -1043,6 +1129,7 @@
     <w:p>
       <w:pPr>
         <w:pStyle w:val="ListBullet"/>
+        <w:keepNext/>
         <w:spacing w:after="20" w:line="252" w:lineRule="auto"/>
         <w:ind w:left="283" w:hanging="170"/>
       </w:pPr>
@@ -1059,6 +1146,7 @@
     <w:p>
       <w:pPr>
         <w:pStyle w:val="ListBullet"/>
+        <w:keepNext/>
         <w:spacing w:after="20" w:line="252" w:lineRule="auto"/>
         <w:ind w:left="283" w:hanging="170"/>
       </w:pPr>
@@ -1074,6 +1162,7 @@
     </w:p>
     <w:p>
       <w:pPr>
+        <w:keepNext/>
         <w:spacing w:after="0" w:before="0"/>
       </w:pPr>
       <w:r>
@@ -1102,8 +1191,9 @@
     </w:p>
     <w:p>
       <w:pPr>
+        <w:keepNext/>
         <w:tabs>
-          <w:tab w:pos="10540" w:val="right"/>
+          <w:tab w:pos="10206" w:val="right"/>
         </w:tabs>
         <w:spacing w:after="0" w:before="0"/>
       </w:pPr>
@@ -1130,6 +1220,7 @@
     <w:p>
       <w:pPr>
         <w:pStyle w:val="ListBullet"/>
+        <w:keepNext/>
         <w:spacing w:after="20" w:line="252" w:lineRule="auto"/>
         <w:ind w:left="283" w:hanging="170"/>
       </w:pPr>
@@ -1146,6 +1237,7 @@
     <w:p>
       <w:pPr>
         <w:pStyle w:val="ListBullet"/>
+        <w:keepNext/>
         <w:spacing w:after="20" w:line="252" w:lineRule="auto"/>
         <w:ind w:left="283" w:hanging="170"/>
       </w:pPr>
@@ -1161,6 +1253,7 @@
     </w:p>
     <w:p>
       <w:pPr>
+        <w:keepNext/>
         <w:spacing w:after="0" w:before="0"/>
       </w:pPr>
       <w:r>
@@ -1189,8 +1282,9 @@
     </w:p>
     <w:p>
       <w:pPr>
+        <w:keepNext/>
         <w:tabs>
-          <w:tab w:pos="10540" w:val="right"/>
+          <w:tab w:pos="10206" w:val="right"/>
         </w:tabs>
         <w:spacing w:after="0" w:before="0"/>
       </w:pPr>
@@ -1217,6 +1311,7 @@
     <w:p>
       <w:pPr>
         <w:pStyle w:val="ListBullet"/>
+        <w:keepNext/>
         <w:spacing w:after="20" w:line="252" w:lineRule="auto"/>
         <w:ind w:left="283" w:hanging="170"/>
       </w:pPr>
@@ -1233,6 +1328,7 @@
     <w:p>
       <w:pPr>
         <w:pStyle w:val="ListBullet"/>
+        <w:keepNext/>
         <w:spacing w:after="20" w:line="252" w:lineRule="auto"/>
         <w:ind w:left="283" w:hanging="170"/>
       </w:pPr>
@@ -1248,6 +1344,7 @@
     </w:p>
     <w:p>
       <w:pPr>
+        <w:keepNext/>
         <w:spacing w:after="0" w:before="0"/>
       </w:pPr>
       <w:r>
@@ -1276,8 +1373,9 @@
     </w:p>
     <w:p>
       <w:pPr>
+        <w:keepNext/>
         <w:tabs>
-          <w:tab w:pos="10540" w:val="right"/>
+          <w:tab w:pos="10206" w:val="right"/>
         </w:tabs>
         <w:spacing w:after="0" w:before="0"/>
       </w:pPr>
@@ -1304,6 +1402,7 @@
     <w:p>
       <w:pPr>
         <w:pStyle w:val="ListBullet"/>
+        <w:keepNext/>
         <w:spacing w:after="20" w:line="252" w:lineRule="auto"/>
         <w:ind w:left="283" w:hanging="170"/>
       </w:pPr>
@@ -1320,6 +1419,7 @@
     <w:p>
       <w:pPr>
         <w:pStyle w:val="ListBullet"/>
+        <w:keepNext/>
         <w:spacing w:after="20" w:line="252" w:lineRule="auto"/>
         <w:ind w:left="283" w:hanging="170"/>
       </w:pPr>
@@ -1335,6 +1435,7 @@
     </w:p>
     <w:p>
       <w:pPr>
+        <w:keepNext/>
         <w:spacing w:after="0" w:before="0"/>
       </w:pPr>
       <w:r>
@@ -1363,6 +1464,7 @@
     </w:p>
     <w:p>
       <w:pPr>
+        <w:keepNext/>
         <w:spacing w:after="60" w:before="180"/>
         <w:pBdr>
           <w:bottom w:val="single" w:sz="8" w:space="1" w:color="1A1A1A"/>
@@ -1380,8 +1482,9 @@
     </w:p>
     <w:p>
       <w:pPr>
+        <w:keepNext/>
         <w:tabs>
-          <w:tab w:pos="10540" w:val="right"/>
+          <w:tab w:pos="10206" w:val="right"/>
         </w:tabs>
         <w:spacing w:after="0" w:before="0"/>
       </w:pPr>
@@ -1407,8 +1510,9 @@
     </w:p>
     <w:p>
       <w:pPr>
+        <w:keepNext/>
         <w:tabs>
-          <w:tab w:pos="10540" w:val="right"/>
+          <w:tab w:pos="10206" w:val="right"/>
         </w:tabs>
         <w:spacing w:after="0" w:before="0"/>
       </w:pPr>
@@ -1429,8 +1533,9 @@
     </w:p>
     <w:p>
       <w:pPr>
+        <w:keepNext/>
         <w:tabs>
-          <w:tab w:pos="10540" w:val="right"/>
+          <w:tab w:pos="10206" w:val="right"/>
         </w:tabs>
         <w:spacing w:after="0" w:before="0"/>
       </w:pPr>
@@ -1456,8 +1561,9 @@
     </w:p>
     <w:p>
       <w:pPr>
+        <w:keepNext/>
         <w:tabs>
-          <w:tab w:pos="10540" w:val="right"/>
+          <w:tab w:pos="10206" w:val="right"/>
         </w:tabs>
         <w:spacing w:after="0" w:before="0"/>
       </w:pPr>
@@ -1478,6 +1584,7 @@
     </w:p>
     <w:p>
       <w:pPr>
+        <w:keepNext/>
         <w:spacing w:after="60" w:before="180"/>
         <w:pBdr>
           <w:bottom w:val="single" w:sz="8" w:space="1" w:color="1A1A1A"/>
@@ -1495,8 +1602,9 @@
     </w:p>
     <w:p>
       <w:pPr>
+        <w:keepNext/>
         <w:tabs>
-          <w:tab w:pos="10540" w:val="right"/>
+          <w:tab w:pos="10206" w:val="right"/>
         </w:tabs>
         <w:spacing w:after="0" w:before="0"/>
       </w:pPr>
@@ -1522,8 +1630,9 @@
     </w:p>
     <w:p>
       <w:pPr>
+        <w:keepNext/>
         <w:tabs>
-          <w:tab w:pos="10540" w:val="right"/>
+          <w:tab w:pos="10206" w:val="right"/>
         </w:tabs>
         <w:spacing w:after="0" w:before="0"/>
       </w:pPr>
@@ -1544,7 +1653,7 @@
           <w:sz w:val="20"/>
         </w:rPr>
         <w:tab/>
-        <w:t>Aug 2023 – Present</w:t>
+        <w:t>Aug 2023 – Aug 2027 (expected)</w:t>
       </w:r>
     </w:p>
     <w:p>
@@ -1554,6 +1663,7 @@
     </w:p>
     <w:p>
       <w:pPr>
+        <w:keepNext/>
         <w:spacing w:after="60" w:before="180"/>
         <w:pBdr>
           <w:bottom w:val="single" w:sz="8" w:space="1" w:color="1A1A1A"/>
@@ -1695,7 +1805,7 @@
       </w:r>
     </w:p>
     <w:sectPr>
-      <w:pgSz w:w="12240" w:h="15840"/>
+      <w:pgSz w:w="11906" w:h="16838"/>
       <w:pgMar w:top="850" w:right="850" w:bottom="850" w:left="850" w:header="720" w:footer="720" w:gutter="0"/>
       <w:cols w:space="720"/>
       <w:docGrid w:linePitch="360"/>

</xml_diff>